<commit_message>
fix(preview): drop escaped SVG paint values and keep picture bullets (ENG-3594)
</commit_message>
<xml_diff>
--- a/e2e/document-preview/fixtures/docx/vml-url.docx
+++ b/e2e/document-preview/fixtures/docx/vml-url.docx
@@ -14,6 +14,15 @@
         </w:pict>
       </w:r>
     </w:p>
+    <w:p>
+      <w:r>
+        <w:pict>
+          <v:rect style="width:100pt;height:50pt" fillcolor="u\72l(http://localhost:9/vml-fill-escaped#paint)">
+            <v:stroke color="u\72l(http://127.0.0.1:9/vml-stroke-escaped#paint)"/>
+          </v:rect>
+        </w:pict>
+      </w:r>
+    </w:p>
     <w:sectPr>
       <w:pgSz w:w="12240" w:h="15840"/>
       <w:pgMar w:top="1440" w:right="1440" w:bottom="1440" w:left="1440" w:header="720" w:footer="720" w:gutter="0"/>

</xml_diff>